<commit_message>
chore: add last-verified stamps to all technical docs; add glossary to conversion list
- Data_Dictionary.md: add "Last verified against: v4.sqlite — 2026-02-26"
- database_summary.md: add "Last verified against: v4.sqlite — 2026-02-26"
- glossary.md: add "Last verified: 2026-02-26"
- make_word_docs.py: add glossary.md and database_summary.md to conversion list
  so all technical docs stay in sync via make_word_docs.py

Co-Authored-By: Claude Sonnet 4.6 <noreply@anthropic.com>
</commit_message>
<xml_diff>
--- a/Data_Dictionary.docx
+++ b/Data_Dictionary.docx
@@ -89,6 +89,27 @@
       </w:r>
       <w:r>
         <w:t xml:space="preserve"> 2.0</w:t>
+      </w:r>
+    </w:p>
+    <w:p>
+      <w:r>
+        <w:rPr>
+          <w:b/>
+        </w:rPr>
+        <w:t>Last verified against:</w:t>
+      </w:r>
+      <w:r>
+        <w:t xml:space="preserve"> </w:t>
+      </w:r>
+      <w:r>
+        <w:rPr>
+          <w:rFonts w:ascii="Courier New" w:hAnsi="Courier New"/>
+          <w:sz w:val="20"/>
+        </w:rPr>
+        <w:t>figure_skating_ijs_v4.sqlite</w:t>
+      </w:r>
+      <w:r>
+        <w:t xml:space="preserve"> — 2026-02-26</w:t>
       </w:r>
     </w:p>
     <w:p>

</xml_diff>

<commit_message>
fix: update Data_Dictionary to isuimpact_residual_v1 (v2 method)
- pairwise_impact_results: 543,456 rows (271,728 per method); update
  description from quantile null to residual-label permutation
- judge_team_impacts: 48,348 rows (24,174 per method)
- Both tables: script → calculate_isuimpact_v2.py, method → isuimpact_residual_v1
- Section 7 method params: quantile_v1 → residual_v1; add null distribution row;
  remove CDF scope; update computed date to 2026-02-27
- Last verified stamp updated to 2026-02-27

Co-Authored-By: Claude Sonnet 4.6 <noreply@anthropic.com>
</commit_message>
<xml_diff>
--- a/Data_Dictionary.docx
+++ b/Data_Dictionary.docx
@@ -23,7 +23,7 @@
           <w:color w:val="606060"/>
           <w:sz w:val="20"/>
         </w:rPr>
-        <w:t>Michael Allman  |  February 26, 2026  |  Judging Bias in Competitive Figure Skating</w:t>
+        <w:t>Michael Allman  |  February 27, 2026  |  Judging Bias in Competitive Figure Skating</w:t>
       </w:r>
     </w:p>
     <w:p/>
@@ -109,7 +109,7 @@
         <w:t>figure_skating_ijs_v4.sqlite</w:t>
       </w:r>
       <w:r>
-        <w:t xml:space="preserve"> — 2026-02-26</w:t>
+        <w:t xml:space="preserve"> — 2026-02-27</w:t>
       </w:r>
     </w:p>
     <w:p>
@@ -8413,12 +8413,32 @@
           <w:i w:val="0"/>
           <w:sz w:val="24"/>
         </w:rPr>
-        <w:t>4.3 `pairwise_impact_results` — 271,728 rows</w:t>
+        <w:t>4.3 `pairwise_impact_results` — 543,456 rows (271,728 per method)</w:t>
       </w:r>
     </w:p>
     <w:p>
       <w:r>
-        <w:t>Core ISU-impact results: pairwise bias tests for every (judge, entry_a, entry_b) combination in every analyzed event. The ISU-impact method applies a style-adjusted quantile permutation null with M = 10,000 permutations, seed = 20260223, global CDF scope, and BH-FDR correction applied within each event.</w:t>
+        <w:t>Core ISU-impact results: pairwise bias tests for every (judge, entry_a, entry_b) combination in every analyzed event. The table contains results for two method versions; the current published method (</w:t>
+      </w:r>
+      <w:r>
+        <w:rPr>
+          <w:rFonts w:ascii="Courier New" w:hAnsi="Courier New"/>
+          <w:sz w:val="20"/>
+        </w:rPr>
+        <w:t>isuimpact_residual_v1</w:t>
+      </w:r>
+      <w:r>
+        <w:t>) applies a residual-label permutation null with M = 10,000 permutations, seed = 20260223, and BH-FDR correction applied within each event. The retired method (</w:t>
+      </w:r>
+      <w:r>
+        <w:rPr>
+          <w:rFonts w:ascii="Courier New" w:hAnsi="Courier New"/>
+          <w:sz w:val="20"/>
+        </w:rPr>
+        <w:t>isuimpact_quantile_v1</w:t>
+      </w:r>
+      <w:r>
+        <w:t>) is retained for reference only.</w:t>
       </w:r>
     </w:p>
     <w:p>
@@ -8430,6 +8450,26 @@
       </w:r>
       <w:r>
         <w:t xml:space="preserve"> </w:t>
+      </w:r>
+      <w:r>
+        <w:rPr>
+          <w:rFonts w:ascii="Courier New" w:hAnsi="Courier New"/>
+          <w:sz w:val="20"/>
+        </w:rPr>
+        <w:t>calculate_isuimpact_v2.py</w:t>
+      </w:r>
+      <w:r>
+        <w:t xml:space="preserve"> (current, method: </w:t>
+      </w:r>
+      <w:r>
+        <w:rPr>
+          <w:rFonts w:ascii="Courier New" w:hAnsi="Courier New"/>
+          <w:sz w:val="20"/>
+        </w:rPr>
+        <w:t>isuimpact_residual_v1</w:t>
+      </w:r>
+      <w:r>
+        <w:t xml:space="preserve">); retired v1 rows produced by </w:t>
       </w:r>
       <w:r>
         <w:rPr>
@@ -8592,7 +8632,7 @@
                 <w:i w:val="0"/>
                 <w:sz w:val="20"/>
               </w:rPr>
-              <w:t>`"isuimpact_quantile_v1"`</w:t>
+              <w:t>`"isuimpact_residual_v1"` (current published) or `"isuimpact_quantile_v1"` (retired)</w:t>
             </w:r>
           </w:p>
         </w:tc>
@@ -9628,7 +9668,17 @@
         <w:t>Coverage:</w:t>
       </w:r>
       <w:r>
-        <w:t xml:space="preserve"> 271,728 rows = 9 judges × C(N, 2) entry pairs × 142 analyzed events.</w:t>
+        <w:t xml:space="preserve"> 271,728 rows per method (543,456 total) = 9 judges × C(N, 2) entry pairs × 142 analyzed events. Filter on </w:t>
+      </w:r>
+      <w:r>
+        <w:rPr>
+          <w:rFonts w:ascii="Courier New" w:hAnsi="Courier New"/>
+          <w:sz w:val="20"/>
+        </w:rPr>
+        <w:t>method_version = 'isuimpact_residual_v1'</w:t>
+      </w:r>
+      <w:r>
+        <w:t xml:space="preserve"> for published results.</w:t>
       </w:r>
     </w:p>
     <w:p>
@@ -9641,7 +9691,7 @@
           <w:i w:val="0"/>
           <w:sz w:val="24"/>
         </w:rPr>
-        <w:t>4.4 `judge_team_impacts` — 24,174 rows</w:t>
+        <w:t>4.4 `judge_team_impacts` — 48,348 rows (24,174 per method)</w:t>
       </w:r>
     </w:p>
     <w:p>
@@ -9664,6 +9714,26 @@
           <w:rFonts w:ascii="Courier New" w:hAnsi="Courier New"/>
           <w:sz w:val="20"/>
         </w:rPr>
+        <w:t>calculate_isuimpact_v2.py</w:t>
+      </w:r>
+      <w:r>
+        <w:t xml:space="preserve"> (current, method: </w:t>
+      </w:r>
+      <w:r>
+        <w:rPr>
+          <w:rFonts w:ascii="Courier New" w:hAnsi="Courier New"/>
+          <w:sz w:val="20"/>
+        </w:rPr>
+        <w:t>isuimpact_residual_v1</w:t>
+      </w:r>
+      <w:r>
+        <w:t xml:space="preserve">); retired v1 rows produced by </w:t>
+      </w:r>
+      <w:r>
+        <w:rPr>
+          <w:rFonts w:ascii="Courier New" w:hAnsi="Courier New"/>
+          <w:sz w:val="20"/>
+        </w:rPr>
         <w:t>calculate_isuimpact_v1.py</w:t>
       </w:r>
     </w:p>
@@ -9820,7 +9890,7 @@
                 <w:i w:val="0"/>
                 <w:sz w:val="20"/>
               </w:rPr>
-              <w:t>`"isuimpact_quantile_v1"`</w:t>
+              <w:t>`"isuimpact_residual_v1"` (current published) or `"isuimpact_quantile_v1"` (retired)</w:t>
             </w:r>
           </w:p>
         </w:tc>
@@ -10767,7 +10837,7 @@
                 <w:i w:val="0"/>
                 <w:sz w:val="20"/>
               </w:rPr>
-              <w:t>`isuimpact_quantile_v1`</w:t>
+              <w:t>`isuimpact_residual_v1`</w:t>
             </w:r>
           </w:p>
         </w:tc>
@@ -10853,7 +10923,7 @@
                 <w:i w:val="0"/>
                 <w:sz w:val="20"/>
               </w:rPr>
-              <w:t>CDF scope</w:t>
+              <w:t>Null distribution</w:t>
             </w:r>
           </w:p>
         </w:tc>
@@ -10869,7 +10939,7 @@
                 <w:i w:val="0"/>
                 <w:sz w:val="20"/>
               </w:rPr>
-              <w:t>Global (CDFs built from all 142 analyzed events)</w:t>
+              <w:t>Residual-label permutation (Emerson et al. 2009)</w:t>
             </w:r>
           </w:p>
         </w:tc>
@@ -10971,7 +11041,7 @@
                 <w:i w:val="0"/>
                 <w:sz w:val="20"/>
               </w:rPr>
-              <w:t>142 of 144 (events 148, 149 excluded)</w:t>
+              <w:t>142 of 144 (events 148, 149 excluded — 7-judge panels)</w:t>
             </w:r>
           </w:p>
         </w:tc>
@@ -10989,6 +11059,40 @@
                 <w:i w:val="0"/>
                 <w:sz w:val="20"/>
               </w:rPr>
+              <w:t>Computed by</w:t>
+            </w:r>
+          </w:p>
+        </w:tc>
+        <w:tc>
+          <w:tcPr>
+            <w:tcW w:type="dxa" w:w="4320"/>
+          </w:tcPr>
+          <w:p>
+            <w:r/>
+            <w:r>
+              <w:rPr>
+                <w:b w:val="0"/>
+                <w:i w:val="0"/>
+                <w:sz w:val="20"/>
+              </w:rPr>
+              <w:t>`calculate_isuimpact_v2.py`</w:t>
+            </w:r>
+          </w:p>
+        </w:tc>
+      </w:tr>
+      <w:tr>
+        <w:tc>
+          <w:tcPr>
+            <w:tcW w:type="dxa" w:w="4320"/>
+          </w:tcPr>
+          <w:p>
+            <w:r/>
+            <w:r>
+              <w:rPr>
+                <w:b w:val="0"/>
+                <w:i w:val="0"/>
+                <w:sz w:val="20"/>
+              </w:rPr>
               <w:t>Computed</w:t>
             </w:r>
           </w:p>
@@ -11005,7 +11109,7 @@
                 <w:i w:val="0"/>
                 <w:sz w:val="20"/>
               </w:rPr>
-              <w:t>2026-02-24</w:t>
+              <w:t>2026-02-27</w:t>
             </w:r>
           </w:p>
         </w:tc>

</xml_diff>